<commit_message>
Update arb resource data for 2026-08-24 release
</commit_message>
<xml_diff>
--- a/arb/docx/013.content.docx
+++ b/arb/docx/013.content.docx
@@ -9,6 +9,8 @@
       </w:pPr>
       <w:r>
         <w:rPr>
+          <w:rtl/>
+          <w:cs/>
           <w:lang w:val="ar_AE" w:bidi="ar_AE"/>
         </w:rPr>
       </w:r>
@@ -20,69 +22,91 @@
       </w:pPr>
       <w:r>
         <w:rPr>
+          <w:rtl/>
+          <w:cs/>
           <w:lang w:val="ar_AE" w:bidi="ar_AE"/>
         </w:rPr>
         <w:t>Resource: unfoldingWord® Translation Words</w:t>
       </w:r>
       <w:r>
         <w:rPr>
-          <w:lang w:val="ar_AE" w:bidi="ar_AE"/>
-        </w:rPr>
-      </w:r>
-    </w:p>
-    <w:p>
-      <w:pPr>
-        <w:bidi/>
-      </w:pPr>
-      <w:r>
-        <w:rPr>
+          <w:rtl/>
+          <w:cs/>
+          <w:lang w:val="ar_AE" w:bidi="ar_AE"/>
+        </w:rPr>
+      </w:r>
+    </w:p>
+    <w:p>
+      <w:pPr>
+        <w:bidi/>
+      </w:pPr>
+      <w:r>
+        <w:rPr>
+          <w:rtl/>
+          <w:cs/>
           <w:lang w:val="ar_AE" w:bidi="ar_AE"/>
         </w:rPr>
       </w:r>
       <w:r>
         <w:rPr>
           <w:b/>
+          <w:rtl/>
+          <w:cs/>
           <w:lang w:val="ar_AE" w:bidi="ar_AE"/>
         </w:rPr>
         <w:t>unfoldingWord® Translation Words</w:t>
       </w:r>
       <w:r>
         <w:rPr>
+          <w:rtl/>
+          <w:cs/>
           <w:lang w:val="ar_AE" w:bidi="ar_AE"/>
         </w:rPr>
         <w:t xml:space="preserve"> © 2022 unfoldingWord. Released under CC BY-SA 4.0 license. </w:t>
       </w:r>
       <w:r>
         <w:rPr>
+          <w:rtl/>
+          <w:cs/>
           <w:lang w:val="ar_AE" w:bidi="ar_AE"/>
         </w:rPr>
         <w:t>unfoldingWord® Translation Words</w:t>
       </w:r>
       <w:r>
         <w:rPr>
+          <w:rtl/>
+          <w:cs/>
           <w:lang w:val="ar_AE" w:bidi="ar_AE"/>
         </w:rPr>
         <w:t xml:space="preserve"> has been adapted in the following languages: Tok Pisin, Arabic (عربي), French (Français), Hindi (हिंदी), Indonesian (Bahasa Indonesia), Portuguese (Português), Russian (Русский), Spanish (Español), Swahili (Kiswahili), and Simplified Chinese (简体中文) from </w:t>
       </w:r>
       <w:r>
         <w:rPr>
+          <w:rtl/>
+          <w:cs/>
           <w:lang w:val="ar_AE" w:bidi="ar_AE"/>
         </w:rPr>
         <w:t>unfoldingWord® Translation Words</w:t>
       </w:r>
       <w:r>
         <w:rPr>
+          <w:rtl/>
+          <w:cs/>
           <w:lang w:val="ar_AE" w:bidi="ar_AE"/>
         </w:rPr>
         <w:t xml:space="preserve"> © 2022 unfoldingWord. Released under CC BY-SA 4.0 license by Mission Mutual</w:t>
       </w:r>
       <w:r>
         <w:rPr>
-          <w:lang w:val="ar_AE" w:bidi="ar_AE"/>
-        </w:rPr>
-      </w:r>
-      <w:r>
-        <w:rPr>
+          <w:rtl/>
+          <w:cs/>
+          <w:lang w:val="ar_AE" w:bidi="ar_AE"/>
+        </w:rPr>
+      </w:r>
+      <w:r>
+        <w:rPr>
+          <w:rtl/>
+          <w:cs/>
           <w:lang w:val="ar_AE" w:bidi="ar_AE"/>
         </w:rPr>
       </w:r>
@@ -94,6 +118,8 @@
       </w:pPr>
       <w:r>
         <w:rPr>
+          <w:rtl/>
+          <w:cs/>
           <w:lang w:val="ar_AE" w:bidi="ar_AE"/>
         </w:rPr>
         <w:t>unfoldingWord® Translation Words</w:t>
@@ -123,6 +149,8 @@
       </w:pPr>
       <w:r>
         <w:rPr>
+          <w:rtl/>
+          <w:cs/>
           <w:lang w:val="ar_AE" w:bidi="ar_AE"/>
         </w:rPr>
       </w:r>
@@ -134,38 +162,50 @@
       </w:pPr>
       <w:r>
         <w:rPr>
+          <w:rtl/>
+          <w:cs/>
           <w:lang w:val="ar_AE" w:bidi="ar_AE"/>
         </w:rPr>
         <w:t>ض</w:t>
       </w:r>
       <w:r>
         <w:rPr>
-          <w:lang w:val="ar_AE" w:bidi="ar_AE"/>
-        </w:rPr>
-      </w:r>
-    </w:p>
-    <w:p>
-      <w:pPr>
-        <w:bidi/>
-      </w:pPr>
-      <w:r>
-        <w:rPr>
-          <w:lang w:val="ar_AE" w:bidi="ar_AE"/>
-        </w:rPr>
-      </w:r>
-      <w:r>
-        <w:rPr>
+          <w:rtl/>
+          <w:cs/>
+          <w:lang w:val="ar_AE" w:bidi="ar_AE"/>
+        </w:rPr>
+      </w:r>
+    </w:p>
+    <w:p>
+      <w:pPr>
+        <w:bidi/>
+      </w:pPr>
+      <w:r>
+        <w:rPr>
+          <w:rtl/>
+          <w:cs/>
+          <w:lang w:val="ar_AE" w:bidi="ar_AE"/>
+        </w:rPr>
+      </w:r>
+      <w:r>
+        <w:rPr>
+          <w:rtl/>
+          <w:cs/>
           <w:lang w:val="ar_AE" w:bidi="ar_AE"/>
         </w:rPr>
         <w:t xml:space="preserve"> </w:t>
       </w:r>
       <w:r>
         <w:rPr>
-          <w:lang w:val="ar_AE" w:bidi="ar_AE"/>
-        </w:rPr>
-      </w:r>
-      <w:r>
-        <w:rPr>
+          <w:rtl/>
+          <w:cs/>
+          <w:lang w:val="ar_AE" w:bidi="ar_AE"/>
+        </w:rPr>
+      </w:r>
+      <w:r>
+        <w:rPr>
+          <w:rtl/>
+          <w:cs/>
           <w:lang w:val="ar_AE" w:bidi="ar_AE"/>
         </w:rPr>
       </w:r>
@@ -191,6 +231,8 @@
       </w:pPr>
       <w:r>
         <w:rPr>
+          <w:rtl/>
+          <w:cs/>
           <w:lang w:val="ar_AE" w:bidi="ar_AE"/>
         </w:rPr>
       </w:r>
@@ -202,12 +244,16 @@
       </w:pPr>
       <w:r>
         <w:rPr>
+          <w:rtl/>
+          <w:cs/>
           <w:lang w:val="ar_AE" w:bidi="ar_AE"/>
         </w:rPr>
         <w:t>الضَّيْق</w:t>
       </w:r>
       <w:r>
         <w:rPr>
+          <w:rtl/>
+          <w:cs/>
           <w:lang w:val="ar_AE" w:bidi="ar_AE"/>
         </w:rPr>
       </w:r>
@@ -220,6 +266,8 @@
       <w:r>
         <w:rPr>
           <w:b/>
+          <w:rtl/>
+          <w:cs/>
           <w:lang w:val="ar_AE" w:bidi="ar_AE"/>
         </w:rPr>
         <w:t>الضَّيْق</w:t>
@@ -232,6 +280,8 @@
       </w:pPr>
       <w:r>
         <w:rPr>
+          <w:rtl/>
+          <w:cs/>
           <w:lang w:val="ar_AE" w:bidi="ar_AE"/>
         </w:rPr>
         <w:t>التعريف:</w:t>
@@ -243,11 +293,15 @@
       </w:pPr>
       <w:r>
         <w:rPr>
-          <w:lang w:val="ar_AE" w:bidi="ar_AE"/>
-        </w:rPr>
-      </w:r>
-      <w:r>
-        <w:rPr>
+          <w:rtl/>
+          <w:cs/>
+          <w:lang w:val="ar_AE" w:bidi="ar_AE"/>
+        </w:rPr>
+      </w:r>
+      <w:r>
+        <w:rPr>
+          <w:rtl/>
+          <w:cs/>
           <w:lang w:val="ar_AE" w:bidi="ar_AE"/>
         </w:rPr>
         <w:t>يشير مصطلح "</w:t>
@@ -255,12 +309,16 @@
       <w:r>
         <w:rPr>
           <w:b/>
+          <w:rtl/>
+          <w:cs/>
           <w:lang w:val="ar_AE" w:bidi="ar_AE"/>
         </w:rPr>
         <w:t>الضَّيْق</w:t>
       </w:r>
       <w:r>
         <w:rPr>
+          <w:rtl/>
+          <w:cs/>
           <w:lang w:val="ar_AE" w:bidi="ar_AE"/>
         </w:rPr>
         <w:t>" إلى الألم الشديد أو الاضطراب.</w:t>
@@ -275,11 +333,15 @@
       </w:pPr>
       <w:r>
         <w:rPr>
-          <w:lang w:val="ar_AE" w:bidi="ar_AE"/>
-        </w:rPr>
-      </w:r>
-      <w:r>
-        <w:rPr>
+          <w:rtl/>
+          <w:cs/>
+          <w:lang w:val="ar_AE" w:bidi="ar_AE"/>
+        </w:rPr>
+      </w:r>
+      <w:r>
+        <w:rPr>
+          <w:rtl/>
+          <w:cs/>
           <w:lang w:val="ar_AE" w:bidi="ar_AE"/>
         </w:rPr>
         <w:t>ربما يكون الضيق ألمًا جسديًا أو عاطفيًا أو اضطرابًا شديدًا.</w:t>
@@ -294,11 +356,15 @@
       </w:pPr>
       <w:r>
         <w:rPr>
-          <w:lang w:val="ar_AE" w:bidi="ar_AE"/>
-        </w:rPr>
-      </w:r>
-      <w:r>
-        <w:rPr>
+          <w:rtl/>
+          <w:cs/>
+          <w:lang w:val="ar_AE" w:bidi="ar_AE"/>
+        </w:rPr>
+      </w:r>
+      <w:r>
+        <w:rPr>
+          <w:rtl/>
+          <w:cs/>
           <w:lang w:val="ar_AE" w:bidi="ar_AE"/>
         </w:rPr>
         <w:t>غالبًا ما ينعكس الضيق على وجوه الأشخاص المتألمين وعلى سلوكياتهم.</w:t>
@@ -313,11 +379,15 @@
       </w:pPr>
       <w:r>
         <w:rPr>
-          <w:lang w:val="ar_AE" w:bidi="ar_AE"/>
-        </w:rPr>
-      </w:r>
-      <w:r>
-        <w:rPr>
+          <w:rtl/>
+          <w:cs/>
+          <w:lang w:val="ar_AE" w:bidi="ar_AE"/>
+        </w:rPr>
+      </w:r>
+      <w:r>
+        <w:rPr>
+          <w:rtl/>
+          <w:cs/>
           <w:lang w:val="ar_AE" w:bidi="ar_AE"/>
         </w:rPr>
         <w:t xml:space="preserve">على سبيل المثال، الشخص الذي يعاني من ألم شديد أو ضيقٍ ربما يصرّ على أسنانه، أو قد يصرخ بصوت عالٍ. </w:t>
@@ -332,11 +402,15 @@
       </w:pPr>
       <w:r>
         <w:rPr>
-          <w:lang w:val="ar_AE" w:bidi="ar_AE"/>
-        </w:rPr>
-      </w:r>
-      <w:r>
-        <w:rPr>
+          <w:rtl/>
+          <w:cs/>
+          <w:lang w:val="ar_AE" w:bidi="ar_AE"/>
+        </w:rPr>
+      </w:r>
+      <w:r>
+        <w:rPr>
+          <w:rtl/>
+          <w:cs/>
           <w:lang w:val="ar_AE" w:bidi="ar_AE"/>
         </w:rPr>
         <w:t>يمكن أيضًا تَرْجَمَة مصطلح "الضيق" إلى "الاضطراب العاطفي" أو "الحزن العميق" أو "الألم الشديد".</w:t>
@@ -349,6 +423,8 @@
       </w:pPr>
       <w:r>
         <w:rPr>
+          <w:rtl/>
+          <w:cs/>
           <w:lang w:val="ar_AE" w:bidi="ar_AE"/>
         </w:rPr>
         <w:t>مراجع الكتاب المقدس:</w:t>
@@ -363,12 +439,16 @@
       </w:pPr>
       <w:r>
         <w:rPr>
+          <w:rtl/>
+          <w:cs/>
           <w:lang w:val="ar_AE" w:bidi="ar_AE"/>
         </w:rPr>
       </w:r>
       <w:hyperlink r:id="rId13">
         <w:r>
           <w:rPr>
+            <w:rtl/>
+            <w:cs/>
             <w:lang w:val="ar_AE" w:bidi="ar_AE"/>
           </w:rPr>
           <w:rPr>
@@ -388,12 +468,16 @@
       </w:pPr>
       <w:r>
         <w:rPr>
+          <w:rtl/>
+          <w:cs/>
           <w:lang w:val="ar_AE" w:bidi="ar_AE"/>
         </w:rPr>
       </w:r>
       <w:hyperlink r:id="rId14">
         <w:r>
           <w:rPr>
+            <w:rtl/>
+            <w:cs/>
             <w:lang w:val="ar_AE" w:bidi="ar_AE"/>
           </w:rPr>
           <w:rPr>
@@ -413,12 +497,16 @@
       </w:pPr>
       <w:r>
         <w:rPr>
+          <w:rtl/>
+          <w:cs/>
           <w:lang w:val="ar_AE" w:bidi="ar_AE"/>
         </w:rPr>
       </w:r>
       <w:hyperlink r:id="rId15">
         <w:r>
           <w:rPr>
+            <w:rtl/>
+            <w:cs/>
             <w:lang w:val="ar_AE" w:bidi="ar_AE"/>
           </w:rPr>
           <w:rPr>
@@ -438,12 +526,16 @@
       </w:pPr>
       <w:r>
         <w:rPr>
+          <w:rtl/>
+          <w:cs/>
           <w:lang w:val="ar_AE" w:bidi="ar_AE"/>
         </w:rPr>
       </w:r>
       <w:hyperlink r:id="rId16">
         <w:r>
           <w:rPr>
+            <w:rtl/>
+            <w:cs/>
             <w:lang w:val="ar_AE" w:bidi="ar_AE"/>
           </w:rPr>
           <w:rPr>
@@ -463,12 +555,16 @@
       </w:pPr>
       <w:r>
         <w:rPr>
+          <w:rtl/>
+          <w:cs/>
           <w:lang w:val="ar_AE" w:bidi="ar_AE"/>
         </w:rPr>
       </w:r>
       <w:hyperlink r:id="rId17">
         <w:r>
           <w:rPr>
+            <w:rtl/>
+            <w:cs/>
             <w:lang w:val="ar_AE" w:bidi="ar_AE"/>
           </w:rPr>
           <w:rPr>
@@ -486,6 +582,8 @@
       </w:pPr>
       <w:r>
         <w:rPr>
+          <w:rtl/>
+          <w:cs/>
           <w:lang w:val="ar_AE" w:bidi="ar_AE"/>
         </w:rPr>
         <w:t>بيانات الكلمة:</w:t>
@@ -500,32 +598,42 @@
       </w:pPr>
       <w:r>
         <w:rPr>
-          <w:lang w:val="ar_AE" w:bidi="ar_AE"/>
-        </w:rPr>
-      </w:r>
-      <w:r>
-        <w:rPr>
+          <w:rtl/>
+          <w:cs/>
+          <w:lang w:val="ar_AE" w:bidi="ar_AE"/>
+        </w:rPr>
+      </w:r>
+      <w:r>
+        <w:rPr>
+          <w:rtl/>
+          <w:cs/>
           <w:lang w:val="ar_AE" w:bidi="ar_AE"/>
         </w:rPr>
         <w:t>سترونغ: H2342, H2470, H2479, H3708, H4164, H4689, H4691, H5100, H6695, H6862, H6869, H7267, H7581, G09280, G36000, G49280</w:t>
       </w:r>
       <w:r>
         <w:rPr>
-          <w:lang w:val="ar_AE" w:bidi="ar_AE"/>
-        </w:rPr>
-      </w:r>
-      <w:r>
-        <w:rPr>
-          <w:lang w:val="ar_AE" w:bidi="ar_AE"/>
-        </w:rPr>
-      </w:r>
-    </w:p>
-    <w:p>
-      <w:pPr>
-        <w:bidi/>
-      </w:pPr>
-      <w:r>
-        <w:rPr>
+          <w:rtl/>
+          <w:cs/>
+          <w:lang w:val="ar_AE" w:bidi="ar_AE"/>
+        </w:rPr>
+      </w:r>
+      <w:r>
+        <w:rPr>
+          <w:rtl/>
+          <w:cs/>
+          <w:lang w:val="ar_AE" w:bidi="ar_AE"/>
+        </w:rPr>
+      </w:r>
+    </w:p>
+    <w:p>
+      <w:pPr>
+        <w:bidi/>
+      </w:pPr>
+      <w:r>
+        <w:rPr>
+          <w:rtl/>
+          <w:cs/>
           <w:lang w:val="ar_AE" w:bidi="ar_AE"/>
         </w:rPr>
       </w:r>
@@ -537,12 +645,16 @@
       </w:pPr>
       <w:r>
         <w:rPr>
+          <w:rtl/>
+          <w:cs/>
           <w:lang w:val="ar_AE" w:bidi="ar_AE"/>
         </w:rPr>
         <w:t>ضَبْط النَّفس</w:t>
       </w:r>
       <w:r>
         <w:rPr>
+          <w:rtl/>
+          <w:cs/>
           <w:lang w:val="ar_AE" w:bidi="ar_AE"/>
         </w:rPr>
       </w:r>
@@ -554,6 +666,8 @@
       </w:pPr>
       <w:r>
         <w:rPr>
+          <w:rtl/>
+          <w:cs/>
           <w:lang w:val="ar_AE" w:bidi="ar_AE"/>
         </w:rPr>
         <w:t>التعريف:</w:t>
@@ -565,11 +679,15 @@
       </w:pPr>
       <w:r>
         <w:rPr>
-          <w:lang w:val="ar_AE" w:bidi="ar_AE"/>
-        </w:rPr>
-      </w:r>
-      <w:r>
-        <w:rPr>
+          <w:rtl/>
+          <w:cs/>
+          <w:lang w:val="ar_AE" w:bidi="ar_AE"/>
+        </w:rPr>
+      </w:r>
+      <w:r>
+        <w:rPr>
+          <w:rtl/>
+          <w:cs/>
           <w:lang w:val="ar_AE" w:bidi="ar_AE"/>
         </w:rPr>
         <w:t>ضَبْط النَّفس هو القدرة على التحكُّم في سلوك المرء لتجنب الوقوع في الخطية.</w:t>
@@ -584,11 +702,15 @@
       </w:pPr>
       <w:r>
         <w:rPr>
-          <w:lang w:val="ar_AE" w:bidi="ar_AE"/>
-        </w:rPr>
-      </w:r>
-      <w:r>
-        <w:rPr>
+          <w:rtl/>
+          <w:cs/>
+          <w:lang w:val="ar_AE" w:bidi="ar_AE"/>
+        </w:rPr>
+      </w:r>
+      <w:r>
+        <w:rPr>
+          <w:rtl/>
+          <w:cs/>
           <w:lang w:val="ar_AE" w:bidi="ar_AE"/>
         </w:rPr>
         <w:t>يشير ضَبْط النَّفس إلى حُسن السلوك، بمعنى تجنب الأفكار، والكلام، والأفعال الخاطئة.</w:t>
@@ -603,11 +725,15 @@
       </w:pPr>
       <w:r>
         <w:rPr>
-          <w:lang w:val="ar_AE" w:bidi="ar_AE"/>
-        </w:rPr>
-      </w:r>
-      <w:r>
-        <w:rPr>
+          <w:rtl/>
+          <w:cs/>
+          <w:lang w:val="ar_AE" w:bidi="ar_AE"/>
+        </w:rPr>
+      </w:r>
+      <w:r>
+        <w:rPr>
+          <w:rtl/>
+          <w:cs/>
           <w:lang w:val="ar_AE" w:bidi="ar_AE"/>
         </w:rPr>
         <w:t>ضَبْط النَّفس هي إحدى الثمار أو السمات التي يمنحها الروح القدس للمؤمنين.</w:t>
@@ -622,11 +748,15 @@
       </w:pPr>
       <w:r>
         <w:rPr>
-          <w:lang w:val="ar_AE" w:bidi="ar_AE"/>
-        </w:rPr>
-      </w:r>
-      <w:r>
-        <w:rPr>
+          <w:rtl/>
+          <w:cs/>
+          <w:lang w:val="ar_AE" w:bidi="ar_AE"/>
+        </w:rPr>
+      </w:r>
+      <w:r>
+        <w:rPr>
+          <w:rtl/>
+          <w:cs/>
           <w:lang w:val="ar_AE" w:bidi="ar_AE"/>
         </w:rPr>
         <w:t>الشخص الذي يتمتع بضَبْط النَّفس قادرٌ على منع نفسه من فعل شيء خاطئ قد يرغب في فعله. الله هو الذي يُمكِّن الشخص من أن يكون قادرًا على ضَبْط النَّفس.</w:t>
@@ -638,35 +768,47 @@
       </w:pPr>
       <w:r>
         <w:rPr>
-          <w:lang w:val="ar_AE" w:bidi="ar_AE"/>
-        </w:rPr>
-      </w:r>
-      <w:r>
-        <w:rPr>
+          <w:rtl/>
+          <w:cs/>
+          <w:lang w:val="ar_AE" w:bidi="ar_AE"/>
+        </w:rPr>
+      </w:r>
+      <w:r>
+        <w:rPr>
+          <w:rtl/>
+          <w:cs/>
           <w:lang w:val="ar_AE" w:bidi="ar_AE"/>
         </w:rPr>
         <w:t xml:space="preserve">(انظر أيضًا: </w:t>
       </w:r>
       <w:r>
         <w:rPr>
+          <w:rtl/>
+          <w:cs/>
           <w:lang w:val="ar_AE" w:bidi="ar_AE"/>
         </w:rPr>
         <w:t>ثمرة</w:t>
       </w:r>
       <w:r>
         <w:rPr>
+          <w:rtl/>
+          <w:cs/>
           <w:lang w:val="ar_AE" w:bidi="ar_AE"/>
         </w:rPr>
         <w:t xml:space="preserve">، </w:t>
       </w:r>
       <w:r>
         <w:rPr>
+          <w:rtl/>
+          <w:cs/>
           <w:lang w:val="ar_AE" w:bidi="ar_AE"/>
         </w:rPr>
         <w:t>الروح القدس</w:t>
       </w:r>
       <w:r>
         <w:rPr>
+          <w:rtl/>
+          <w:cs/>
           <w:lang w:val="ar_AE" w:bidi="ar_AE"/>
         </w:rPr>
         <w:t>)</w:t>
@@ -679,6 +821,8 @@
       </w:pPr>
       <w:r>
         <w:rPr>
+          <w:rtl/>
+          <w:cs/>
           <w:lang w:val="ar_AE" w:bidi="ar_AE"/>
         </w:rPr>
         <w:t>مراجع الكتاب المقدس:</w:t>
@@ -693,12 +837,16 @@
       </w:pPr>
       <w:r>
         <w:rPr>
+          <w:rtl/>
+          <w:cs/>
           <w:lang w:val="ar_AE" w:bidi="ar_AE"/>
         </w:rPr>
       </w:r>
       <w:hyperlink r:id="rId18">
         <w:r>
           <w:rPr>
+            <w:rtl/>
+            <w:cs/>
             <w:lang w:val="ar_AE" w:bidi="ar_AE"/>
           </w:rPr>
           <w:rPr>
@@ -718,12 +866,16 @@
       </w:pPr>
       <w:r>
         <w:rPr>
+          <w:rtl/>
+          <w:cs/>
           <w:lang w:val="ar_AE" w:bidi="ar_AE"/>
         </w:rPr>
       </w:r>
       <w:hyperlink r:id="rId19">
         <w:r>
           <w:rPr>
+            <w:rtl/>
+            <w:cs/>
             <w:lang w:val="ar_AE" w:bidi="ar_AE"/>
           </w:rPr>
           <w:rPr>
@@ -743,12 +895,16 @@
       </w:pPr>
       <w:r>
         <w:rPr>
+          <w:rtl/>
+          <w:cs/>
           <w:lang w:val="ar_AE" w:bidi="ar_AE"/>
         </w:rPr>
       </w:r>
       <w:hyperlink r:id="rId20">
         <w:r>
           <w:rPr>
+            <w:rtl/>
+            <w:cs/>
             <w:lang w:val="ar_AE" w:bidi="ar_AE"/>
           </w:rPr>
           <w:rPr>
@@ -768,12 +924,16 @@
       </w:pPr>
       <w:r>
         <w:rPr>
+          <w:rtl/>
+          <w:cs/>
           <w:lang w:val="ar_AE" w:bidi="ar_AE"/>
         </w:rPr>
       </w:r>
       <w:hyperlink r:id="rId21">
         <w:r>
           <w:rPr>
+            <w:rtl/>
+            <w:cs/>
             <w:lang w:val="ar_AE" w:bidi="ar_AE"/>
           </w:rPr>
           <w:rPr>
@@ -791,6 +951,8 @@
       </w:pPr>
       <w:r>
         <w:rPr>
+          <w:rtl/>
+          <w:cs/>
           <w:lang w:val="ar_AE" w:bidi="ar_AE"/>
         </w:rPr>
         <w:t>بيانات الكلمة:</w:t>
@@ -805,32 +967,42 @@
       </w:pPr>
       <w:r>
         <w:rPr>
-          <w:lang w:val="ar_AE" w:bidi="ar_AE"/>
-        </w:rPr>
-      </w:r>
-      <w:r>
-        <w:rPr>
+          <w:rtl/>
+          <w:cs/>
+          <w:lang w:val="ar_AE" w:bidi="ar_AE"/>
+        </w:rPr>
+      </w:r>
+      <w:r>
+        <w:rPr>
+          <w:rtl/>
+          <w:cs/>
           <w:lang w:val="ar_AE" w:bidi="ar_AE"/>
         </w:rPr>
         <w:t>سترونغ: H4623, H7307, G01920, G01930, G14660, G14670, G14680, G49970</w:t>
       </w:r>
       <w:r>
         <w:rPr>
-          <w:lang w:val="ar_AE" w:bidi="ar_AE"/>
-        </w:rPr>
-      </w:r>
-      <w:r>
-        <w:rPr>
-          <w:lang w:val="ar_AE" w:bidi="ar_AE"/>
-        </w:rPr>
-      </w:r>
-    </w:p>
-    <w:p>
-      <w:pPr>
-        <w:bidi/>
-      </w:pPr>
-      <w:r>
-        <w:rPr>
+          <w:rtl/>
+          <w:cs/>
+          <w:lang w:val="ar_AE" w:bidi="ar_AE"/>
+        </w:rPr>
+      </w:r>
+      <w:r>
+        <w:rPr>
+          <w:rtl/>
+          <w:cs/>
+          <w:lang w:val="ar_AE" w:bidi="ar_AE"/>
+        </w:rPr>
+      </w:r>
+    </w:p>
+    <w:p>
+      <w:pPr>
+        <w:bidi/>
+      </w:pPr>
+      <w:r>
+        <w:rPr>
+          <w:rtl/>
+          <w:cs/>
           <w:lang w:val="ar_AE" w:bidi="ar_AE"/>
         </w:rPr>
       </w:r>
@@ -842,12 +1014,16 @@
       </w:pPr>
       <w:r>
         <w:rPr>
+          <w:rtl/>
+          <w:cs/>
           <w:lang w:val="ar_AE" w:bidi="ar_AE"/>
         </w:rPr>
         <w:t>ضد المسيح</w:t>
       </w:r>
       <w:r>
         <w:rPr>
+          <w:rtl/>
+          <w:cs/>
           <w:lang w:val="ar_AE" w:bidi="ar_AE"/>
         </w:rPr>
       </w:r>
@@ -859,6 +1035,8 @@
       </w:pPr>
       <w:r>
         <w:rPr>
+          <w:rtl/>
+          <w:cs/>
           <w:lang w:val="ar_AE" w:bidi="ar_AE"/>
         </w:rPr>
         <w:t>التعريف:</w:t>
@@ -870,11 +1048,15 @@
       </w:pPr>
       <w:r>
         <w:rPr>
-          <w:lang w:val="ar_AE" w:bidi="ar_AE"/>
-        </w:rPr>
-      </w:r>
-      <w:r>
-        <w:rPr>
+          <w:rtl/>
+          <w:cs/>
+          <w:lang w:val="ar_AE" w:bidi="ar_AE"/>
+        </w:rPr>
+      </w:r>
+      <w:r>
+        <w:rPr>
+          <w:rtl/>
+          <w:cs/>
           <w:lang w:val="ar_AE" w:bidi="ar_AE"/>
         </w:rPr>
         <w:t>يشير مصطلح "ضد المسيح" إلى شخص أو تعليم يعارض يسوع المسيح وعمله. وهناك أضداد للمسيح كثيرون في العالم.</w:t>
@@ -889,11 +1071,15 @@
       </w:pPr>
       <w:r>
         <w:rPr>
-          <w:lang w:val="ar_AE" w:bidi="ar_AE"/>
-        </w:rPr>
-      </w:r>
-      <w:r>
-        <w:rPr>
+          <w:rtl/>
+          <w:cs/>
+          <w:lang w:val="ar_AE" w:bidi="ar_AE"/>
+        </w:rPr>
+      </w:r>
+      <w:r>
+        <w:rPr>
+          <w:rtl/>
+          <w:cs/>
           <w:lang w:val="ar_AE" w:bidi="ar_AE"/>
         </w:rPr>
         <w:t>يخبرنا الرسول يوحنا أن الشخص يُعتبر ضدًا للمسيح إذا أضلَّ الناس بالقول إن يسوع ليس المسيح أو إذا أنكر أن يسوع هو الله وإنسانِ معًا.</w:t>
@@ -908,11 +1094,15 @@
       </w:pPr>
       <w:r>
         <w:rPr>
-          <w:lang w:val="ar_AE" w:bidi="ar_AE"/>
-        </w:rPr>
-      </w:r>
-      <w:r>
-        <w:rPr>
+          <w:rtl/>
+          <w:cs/>
+          <w:lang w:val="ar_AE" w:bidi="ar_AE"/>
+        </w:rPr>
+      </w:r>
+      <w:r>
+        <w:rPr>
+          <w:rtl/>
+          <w:cs/>
           <w:lang w:val="ar_AE" w:bidi="ar_AE"/>
         </w:rPr>
         <w:t>كما يُعَلِّمَنَا الكتاب المقدس أن هناك روحًا عامة ضد المسيح في العالم تعارض عمل يسوع.</w:t>
@@ -927,11 +1117,15 @@
       </w:pPr>
       <w:r>
         <w:rPr>
-          <w:lang w:val="ar_AE" w:bidi="ar_AE"/>
-        </w:rPr>
-      </w:r>
-      <w:r>
-        <w:rPr>
+          <w:rtl/>
+          <w:cs/>
+          <w:lang w:val="ar_AE" w:bidi="ar_AE"/>
+        </w:rPr>
+      </w:r>
+      <w:r>
+        <w:rPr>
+          <w:rtl/>
+          <w:cs/>
           <w:lang w:val="ar_AE" w:bidi="ar_AE"/>
         </w:rPr>
         <w:t>الوحش في الإصحاح 13 من سفر الرؤيا في العهد الجديد يُعرف غالبًا بأنه ضد المسيح النهائي. وهذا الشخص أو الكائن سيحاول تدمير شعب الله، لكنه سيُهزم على يد يسوع.</w:t>
@@ -946,11 +1140,15 @@
       </w:pPr>
       <w:r>
         <w:rPr>
-          <w:lang w:val="ar_AE" w:bidi="ar_AE"/>
-        </w:rPr>
-      </w:r>
-      <w:r>
-        <w:rPr>
+          <w:rtl/>
+          <w:cs/>
+          <w:lang w:val="ar_AE" w:bidi="ar_AE"/>
+        </w:rPr>
+      </w:r>
+      <w:r>
+        <w:rPr>
+          <w:rtl/>
+          <w:cs/>
           <w:lang w:val="ar_AE" w:bidi="ar_AE"/>
         </w:rPr>
         <w:t>يشير الرسول بولس إلى هذا الشخص بأنه "إنسان الخطية" (2 تسالونيكي 2: 3) وإلى الروح العامة التي لضد المسيح في العالم بأنها "سر الإثم" (2 تسالونيكي 2: 7).</w:t>
@@ -963,6 +1161,8 @@
       </w:pPr>
       <w:r>
         <w:rPr>
+          <w:rtl/>
+          <w:cs/>
           <w:lang w:val="ar_AE" w:bidi="ar_AE"/>
         </w:rPr>
         <w:t>اقتراحات الترجمة:</w:t>
@@ -977,11 +1177,15 @@
       </w:pPr>
       <w:r>
         <w:rPr>
-          <w:lang w:val="ar_AE" w:bidi="ar_AE"/>
-        </w:rPr>
-      </w:r>
-      <w:r>
-        <w:rPr>
+          <w:rtl/>
+          <w:cs/>
+          <w:lang w:val="ar_AE" w:bidi="ar_AE"/>
+        </w:rPr>
+      </w:r>
+      <w:r>
+        <w:rPr>
+          <w:rtl/>
+          <w:cs/>
           <w:lang w:val="ar_AE" w:bidi="ar_AE"/>
         </w:rPr>
         <w:t>طرق أخرى لترجمة هذا المصطلح يمكن أن تشمل كلمة أو عبارة تعني "معارض المسيح" أو "عدو المسيح" أو "شخص يعارض المسيح".</w:t>
@@ -996,11 +1200,15 @@
       </w:pPr>
       <w:r>
         <w:rPr>
-          <w:lang w:val="ar_AE" w:bidi="ar_AE"/>
-        </w:rPr>
-      </w:r>
-      <w:r>
-        <w:rPr>
+          <w:rtl/>
+          <w:cs/>
+          <w:lang w:val="ar_AE" w:bidi="ar_AE"/>
+        </w:rPr>
+      </w:r>
+      <w:r>
+        <w:rPr>
+          <w:rtl/>
+          <w:cs/>
           <w:lang w:val="ar_AE" w:bidi="ar_AE"/>
         </w:rPr>
         <w:t>يمكن أيضًا ترجمة عبارة "روح ضد المسيح" كـ "روح تعارض المسيح" أو "توجُّه نشر الأكاذيب عن المسيح" أو "روح تعلم الأكاذيب عن المسيح".</w:t>
@@ -1015,11 +1223,15 @@
       </w:pPr>
       <w:r>
         <w:rPr>
-          <w:lang w:val="ar_AE" w:bidi="ar_AE"/>
-        </w:rPr>
-      </w:r>
-      <w:r>
-        <w:rPr>
+          <w:rtl/>
+          <w:cs/>
+          <w:lang w:val="ar_AE" w:bidi="ar_AE"/>
+        </w:rPr>
+      </w:r>
+      <w:r>
+        <w:rPr>
+          <w:rtl/>
+          <w:cs/>
           <w:lang w:val="ar_AE" w:bidi="ar_AE"/>
         </w:rPr>
         <w:t>كما يجب النظر في كيفية ترجمة هذا المصطلح في ترجمة الكتاب المقدس بلغة محلية أو وطنية. (انظر: كيفية ترجمة المجهولات)</w:t>
@@ -1031,35 +1243,47 @@
       </w:pPr>
       <w:r>
         <w:rPr>
-          <w:lang w:val="ar_AE" w:bidi="ar_AE"/>
-        </w:rPr>
-      </w:r>
-      <w:r>
-        <w:rPr>
+          <w:rtl/>
+          <w:cs/>
+          <w:lang w:val="ar_AE" w:bidi="ar_AE"/>
+        </w:rPr>
+      </w:r>
+      <w:r>
+        <w:rPr>
+          <w:rtl/>
+          <w:cs/>
           <w:lang w:val="ar_AE" w:bidi="ar_AE"/>
         </w:rPr>
         <w:t xml:space="preserve">(انظر أيضًا: </w:t>
       </w:r>
       <w:r>
         <w:rPr>
+          <w:rtl/>
+          <w:cs/>
           <w:lang w:val="ar_AE" w:bidi="ar_AE"/>
         </w:rPr>
         <w:t>المسيح</w:t>
       </w:r>
       <w:r>
         <w:rPr>
+          <w:rtl/>
+          <w:cs/>
           <w:lang w:val="ar_AE" w:bidi="ar_AE"/>
         </w:rPr>
         <w:t xml:space="preserve">, </w:t>
       </w:r>
       <w:r>
         <w:rPr>
+          <w:rtl/>
+          <w:cs/>
           <w:lang w:val="ar_AE" w:bidi="ar_AE"/>
         </w:rPr>
         <w:t>الضيقة</w:t>
       </w:r>
       <w:r>
         <w:rPr>
+          <w:rtl/>
+          <w:cs/>
           <w:lang w:val="ar_AE" w:bidi="ar_AE"/>
         </w:rPr>
         <w:t>)</w:t>
@@ -1072,6 +1296,8 @@
       </w:pPr>
       <w:r>
         <w:rPr>
+          <w:rtl/>
+          <w:cs/>
           <w:lang w:val="ar_AE" w:bidi="ar_AE"/>
         </w:rPr>
         <w:t>مراجع الكتاب المقدس:</w:t>
@@ -1086,12 +1312,16 @@
       </w:pPr>
       <w:r>
         <w:rPr>
+          <w:rtl/>
+          <w:cs/>
           <w:lang w:val="ar_AE" w:bidi="ar_AE"/>
         </w:rPr>
       </w:r>
       <w:hyperlink r:id="rId22">
         <w:r>
           <w:rPr>
+            <w:rtl/>
+            <w:cs/>
             <w:lang w:val="ar_AE" w:bidi="ar_AE"/>
           </w:rPr>
           <w:rPr>
@@ -1111,12 +1341,16 @@
       </w:pPr>
       <w:r>
         <w:rPr>
+          <w:rtl/>
+          <w:cs/>
           <w:lang w:val="ar_AE" w:bidi="ar_AE"/>
         </w:rPr>
       </w:r>
       <w:hyperlink r:id="rId23">
         <w:r>
           <w:rPr>
+            <w:rtl/>
+            <w:cs/>
             <w:lang w:val="ar_AE" w:bidi="ar_AE"/>
           </w:rPr>
           <w:rPr>
@@ -1136,12 +1370,16 @@
       </w:pPr>
       <w:r>
         <w:rPr>
+          <w:rtl/>
+          <w:cs/>
           <w:lang w:val="ar_AE" w:bidi="ar_AE"/>
         </w:rPr>
       </w:r>
       <w:hyperlink r:id="rId24">
         <w:r>
           <w:rPr>
+            <w:rtl/>
+            <w:cs/>
             <w:lang w:val="ar_AE" w:bidi="ar_AE"/>
           </w:rPr>
           <w:rPr>
@@ -1161,12 +1399,16 @@
       </w:pPr>
       <w:r>
         <w:rPr>
+          <w:rtl/>
+          <w:cs/>
           <w:lang w:val="ar_AE" w:bidi="ar_AE"/>
         </w:rPr>
       </w:r>
       <w:hyperlink r:id="rId25">
         <w:r>
           <w:rPr>
+            <w:rtl/>
+            <w:cs/>
             <w:lang w:val="ar_AE" w:bidi="ar_AE"/>
           </w:rPr>
           <w:rPr>
@@ -1184,6 +1426,8 @@
       </w:pPr>
       <w:r>
         <w:rPr>
+          <w:rtl/>
+          <w:cs/>
           <w:lang w:val="ar_AE" w:bidi="ar_AE"/>
         </w:rPr>
         <w:t>بيانات الكلمة:</w:t>
@@ -1198,32 +1442,42 @@
       </w:pPr>
       <w:r>
         <w:rPr>
-          <w:lang w:val="ar_AE" w:bidi="ar_AE"/>
-        </w:rPr>
-      </w:r>
-      <w:r>
-        <w:rPr>
+          <w:rtl/>
+          <w:cs/>
+          <w:lang w:val="ar_AE" w:bidi="ar_AE"/>
+        </w:rPr>
+      </w:r>
+      <w:r>
+        <w:rPr>
+          <w:rtl/>
+          <w:cs/>
           <w:lang w:val="ar_AE" w:bidi="ar_AE"/>
         </w:rPr>
         <w:t>سترونج: G05000</w:t>
       </w:r>
       <w:r>
         <w:rPr>
-          <w:lang w:val="ar_AE" w:bidi="ar_AE"/>
-        </w:rPr>
-      </w:r>
-      <w:r>
-        <w:rPr>
-          <w:lang w:val="ar_AE" w:bidi="ar_AE"/>
-        </w:rPr>
-      </w:r>
-    </w:p>
-    <w:p>
-      <w:pPr>
-        <w:bidi/>
-      </w:pPr>
-      <w:r>
-        <w:rPr>
+          <w:rtl/>
+          <w:cs/>
+          <w:lang w:val="ar_AE" w:bidi="ar_AE"/>
+        </w:rPr>
+      </w:r>
+      <w:r>
+        <w:rPr>
+          <w:rtl/>
+          <w:cs/>
+          <w:lang w:val="ar_AE" w:bidi="ar_AE"/>
+        </w:rPr>
+      </w:r>
+    </w:p>
+    <w:p>
+      <w:pPr>
+        <w:bidi/>
+      </w:pPr>
+      <w:r>
+        <w:rPr>
+          <w:rtl/>
+          <w:cs/>
           <w:lang w:val="ar_AE" w:bidi="ar_AE"/>
         </w:rPr>
       </w:r>
@@ -1235,12 +1489,16 @@
       </w:pPr>
       <w:r>
         <w:rPr>
+          <w:rtl/>
+          <w:cs/>
           <w:lang w:val="ar_AE" w:bidi="ar_AE"/>
         </w:rPr>
         <w:t>ضمير</w:t>
       </w:r>
       <w:r>
         <w:rPr>
+          <w:rtl/>
+          <w:cs/>
           <w:lang w:val="ar_AE" w:bidi="ar_AE"/>
         </w:rPr>
       </w:r>
@@ -1252,6 +1510,8 @@
       </w:pPr>
       <w:r>
         <w:rPr>
+          <w:rtl/>
+          <w:cs/>
           <w:lang w:val="ar_AE" w:bidi="ar_AE"/>
         </w:rPr>
         <w:t>التعريف:</w:t>
@@ -1263,11 +1523,15 @@
       </w:pPr>
       <w:r>
         <w:rPr>
-          <w:lang w:val="ar_AE" w:bidi="ar_AE"/>
-        </w:rPr>
-      </w:r>
-      <w:r>
-        <w:rPr>
+          <w:rtl/>
+          <w:cs/>
+          <w:lang w:val="ar_AE" w:bidi="ar_AE"/>
+        </w:rPr>
+      </w:r>
+      <w:r>
+        <w:rPr>
+          <w:rtl/>
+          <w:cs/>
           <w:lang w:val="ar_AE" w:bidi="ar_AE"/>
         </w:rPr>
         <w:t>الضمير هو جزء من فكر الإنسان ينبهه الله من خلاله أنه يفعل أمرًا خاطئًا.</w:t>
@@ -1282,11 +1546,15 @@
       </w:pPr>
       <w:r>
         <w:rPr>
-          <w:lang w:val="ar_AE" w:bidi="ar_AE"/>
-        </w:rPr>
-      </w:r>
-      <w:r>
-        <w:rPr>
+          <w:rtl/>
+          <w:cs/>
+          <w:lang w:val="ar_AE" w:bidi="ar_AE"/>
+        </w:rPr>
+      </w:r>
+      <w:r>
+        <w:rPr>
+          <w:rtl/>
+          <w:cs/>
           <w:lang w:val="ar_AE" w:bidi="ar_AE"/>
         </w:rPr>
         <w:t>لقد منح الله للناس ضميرًا لكي يساعدهم على التمييز بين الصواب و الخطأ</w:t>
@@ -1301,11 +1569,15 @@
       </w:pPr>
       <w:r>
         <w:rPr>
-          <w:lang w:val="ar_AE" w:bidi="ar_AE"/>
-        </w:rPr>
-      </w:r>
-      <w:r>
-        <w:rPr>
+          <w:rtl/>
+          <w:cs/>
+          <w:lang w:val="ar_AE" w:bidi="ar_AE"/>
+        </w:rPr>
+      </w:r>
+      <w:r>
+        <w:rPr>
+          <w:rtl/>
+          <w:cs/>
           <w:lang w:val="ar_AE" w:bidi="ar_AE"/>
         </w:rPr>
         <w:t xml:space="preserve"> إن الشخص الذي يطيع الله يُقال عليه أن له ضمير "طاهر" أو "نقي </w:t>
@@ -1320,11 +1592,15 @@
       </w:pPr>
       <w:r>
         <w:rPr>
-          <w:lang w:val="ar_AE" w:bidi="ar_AE"/>
-        </w:rPr>
-      </w:r>
-      <w:r>
-        <w:rPr>
+          <w:rtl/>
+          <w:cs/>
+          <w:lang w:val="ar_AE" w:bidi="ar_AE"/>
+        </w:rPr>
+      </w:r>
+      <w:r>
+        <w:rPr>
+          <w:rtl/>
+          <w:cs/>
           <w:lang w:val="ar_AE" w:bidi="ar_AE"/>
         </w:rPr>
         <w:t>إذا كان للشخص "ضمير طاهر" فهذا يعني أنه لا يخفي (أو يكتم) بداخله أي خطية</w:t>
@@ -1339,11 +1615,15 @@
       </w:pPr>
       <w:r>
         <w:rPr>
-          <w:lang w:val="ar_AE" w:bidi="ar_AE"/>
-        </w:rPr>
-      </w:r>
-      <w:r>
-        <w:rPr>
+          <w:rtl/>
+          <w:cs/>
+          <w:lang w:val="ar_AE" w:bidi="ar_AE"/>
+        </w:rPr>
+      </w:r>
+      <w:r>
+        <w:rPr>
+          <w:rtl/>
+          <w:cs/>
           <w:lang w:val="ar_AE" w:bidi="ar_AE"/>
         </w:rPr>
         <w:t>إذا تجاهل شخص ما ضميره ولم يعد يشعر بالذنب عندما يخطئ، فهذا يعني أن ضميره لم يعد حساسًا تجاه الخطأ. , و يصف الكتاب المقدس هذا الضمير بأنه "موسوم"، وهو ضمير كأنه "مكويّ بحديد ساخن" . و يُطلق على مثل هذا الضمير أيضًا "الضمير القاسي" أو "الضمير النجس</w:t>
@@ -1358,11 +1638,15 @@
       </w:pPr>
       <w:r>
         <w:rPr>
-          <w:lang w:val="ar_AE" w:bidi="ar_AE"/>
-        </w:rPr>
-      </w:r>
-      <w:r>
-        <w:rPr>
+          <w:rtl/>
+          <w:cs/>
+          <w:lang w:val="ar_AE" w:bidi="ar_AE"/>
+        </w:rPr>
+      </w:r>
+      <w:r>
+        <w:rPr>
+          <w:rtl/>
+          <w:cs/>
           <w:lang w:val="ar_AE" w:bidi="ar_AE"/>
         </w:rPr>
         <w:t>هناك طرق أخرى ممكنة لترجمة هذا المصطلح، و التي قد تشمل: "المرشد الأخلاقي الداخلي" أو "التفكير الأخلاقي</w:t>
@@ -1375,6 +1659,8 @@
       </w:pPr>
       <w:r>
         <w:rPr>
+          <w:rtl/>
+          <w:cs/>
           <w:lang w:val="ar_AE" w:bidi="ar_AE"/>
         </w:rPr>
         <w:t>نصوص كتابية:</w:t>
@@ -1389,12 +1675,16 @@
       </w:pPr>
       <w:r>
         <w:rPr>
+          <w:rtl/>
+          <w:cs/>
           <w:lang w:val="ar_AE" w:bidi="ar_AE"/>
         </w:rPr>
       </w:r>
       <w:hyperlink r:id="rId26">
         <w:r>
           <w:rPr>
+            <w:rtl/>
+            <w:cs/>
             <w:lang w:val="ar_AE" w:bidi="ar_AE"/>
           </w:rPr>
           <w:rPr>
@@ -1414,12 +1704,16 @@
       </w:pPr>
       <w:r>
         <w:rPr>
+          <w:rtl/>
+          <w:cs/>
           <w:lang w:val="ar_AE" w:bidi="ar_AE"/>
         </w:rPr>
       </w:r>
       <w:hyperlink r:id="rId27">
         <w:r>
           <w:rPr>
+            <w:rtl/>
+            <w:cs/>
             <w:lang w:val="ar_AE" w:bidi="ar_AE"/>
           </w:rPr>
           <w:rPr>
@@ -1439,12 +1733,16 @@
       </w:pPr>
       <w:r>
         <w:rPr>
+          <w:rtl/>
+          <w:cs/>
           <w:lang w:val="ar_AE" w:bidi="ar_AE"/>
         </w:rPr>
       </w:r>
       <w:hyperlink r:id="rId28">
         <w:r>
           <w:rPr>
+            <w:rtl/>
+            <w:cs/>
             <w:lang w:val="ar_AE" w:bidi="ar_AE"/>
           </w:rPr>
           <w:rPr>
@@ -1464,12 +1762,16 @@
       </w:pPr>
       <w:r>
         <w:rPr>
+          <w:rtl/>
+          <w:cs/>
           <w:lang w:val="ar_AE" w:bidi="ar_AE"/>
         </w:rPr>
       </w:r>
       <w:hyperlink r:id="rId29">
         <w:r>
           <w:rPr>
+            <w:rtl/>
+            <w:cs/>
             <w:lang w:val="ar_AE" w:bidi="ar_AE"/>
           </w:rPr>
           <w:rPr>
@@ -1489,12 +1791,16 @@
       </w:pPr>
       <w:r>
         <w:rPr>
+          <w:rtl/>
+          <w:cs/>
           <w:lang w:val="ar_AE" w:bidi="ar_AE"/>
         </w:rPr>
       </w:r>
       <w:hyperlink r:id="rId30">
         <w:r>
           <w:rPr>
+            <w:rtl/>
+            <w:cs/>
             <w:lang w:val="ar_AE" w:bidi="ar_AE"/>
           </w:rPr>
           <w:rPr>
@@ -1514,12 +1820,16 @@
       </w:pPr>
       <w:r>
         <w:rPr>
+          <w:rtl/>
+          <w:cs/>
           <w:lang w:val="ar_AE" w:bidi="ar_AE"/>
         </w:rPr>
       </w:r>
       <w:hyperlink r:id="rId31">
         <w:r>
           <w:rPr>
+            <w:rtl/>
+            <w:cs/>
             <w:lang w:val="ar_AE" w:bidi="ar_AE"/>
           </w:rPr>
           <w:rPr>
@@ -1537,6 +1847,8 @@
       </w:pPr>
       <w:r>
         <w:rPr>
+          <w:rtl/>
+          <w:cs/>
           <w:lang w:val="ar_AE" w:bidi="ar_AE"/>
         </w:rPr>
         <w:t>بيانات الكلمة:</w:t>
@@ -1548,32 +1860,42 @@
       </w:pPr>
       <w:r>
         <w:rPr>
-          <w:lang w:val="ar_AE" w:bidi="ar_AE"/>
-        </w:rPr>
-      </w:r>
-      <w:r>
-        <w:rPr>
+          <w:rtl/>
+          <w:cs/>
+          <w:lang w:val="ar_AE" w:bidi="ar_AE"/>
+        </w:rPr>
+      </w:r>
+      <w:r>
+        <w:rPr>
+          <w:rtl/>
+          <w:cs/>
           <w:lang w:val="ar_AE" w:bidi="ar_AE"/>
         </w:rPr>
         <w:t>سترونج: G48930</w:t>
       </w:r>
       <w:r>
         <w:rPr>
-          <w:lang w:val="ar_AE" w:bidi="ar_AE"/>
-        </w:rPr>
-      </w:r>
-      <w:r>
-        <w:rPr>
-          <w:lang w:val="ar_AE" w:bidi="ar_AE"/>
-        </w:rPr>
-      </w:r>
-    </w:p>
-    <w:p>
-      <w:pPr>
-        <w:bidi/>
-      </w:pPr>
-      <w:r>
-        <w:rPr>
+          <w:rtl/>
+          <w:cs/>
+          <w:lang w:val="ar_AE" w:bidi="ar_AE"/>
+        </w:rPr>
+      </w:r>
+      <w:r>
+        <w:rPr>
+          <w:rtl/>
+          <w:cs/>
+          <w:lang w:val="ar_AE" w:bidi="ar_AE"/>
+        </w:rPr>
+      </w:r>
+    </w:p>
+    <w:p>
+      <w:pPr>
+        <w:bidi/>
+      </w:pPr>
+      <w:r>
+        <w:rPr>
+          <w:rtl/>
+          <w:cs/>
           <w:lang w:val="ar_AE" w:bidi="ar_AE"/>
         </w:rPr>
       </w:r>
@@ -1585,12 +1907,16 @@
       </w:pPr>
       <w:r>
         <w:rPr>
+          <w:rtl/>
+          <w:cs/>
           <w:lang w:val="ar_AE" w:bidi="ar_AE"/>
         </w:rPr>
         <w:t>ضيقة</w:t>
       </w:r>
       <w:r>
         <w:rPr>
+          <w:rtl/>
+          <w:cs/>
           <w:lang w:val="ar_AE" w:bidi="ar_AE"/>
         </w:rPr>
       </w:r>
@@ -1602,6 +1928,8 @@
       </w:pPr>
       <w:r>
         <w:rPr>
+          <w:rtl/>
+          <w:cs/>
           <w:lang w:val="ar_AE" w:bidi="ar_AE"/>
         </w:rPr>
         <w:t>التعريف:</w:t>
@@ -1613,11 +1941,15 @@
       </w:pPr>
       <w:r>
         <w:rPr>
-          <w:lang w:val="ar_AE" w:bidi="ar_AE"/>
-        </w:rPr>
-      </w:r>
-      <w:r>
-        <w:rPr>
+          <w:rtl/>
+          <w:cs/>
+          <w:lang w:val="ar_AE" w:bidi="ar_AE"/>
+        </w:rPr>
+      </w:r>
+      <w:r>
+        <w:rPr>
+          <w:rtl/>
+          <w:cs/>
           <w:lang w:val="ar_AE" w:bidi="ar_AE"/>
         </w:rPr>
         <w:t>يشير مصطلح "الضيقة" إلى وقت من الشدة و المعاناة والضيق.</w:t>
@@ -1632,11 +1964,15 @@
       </w:pPr>
       <w:r>
         <w:rPr>
-          <w:lang w:val="ar_AE" w:bidi="ar_AE"/>
-        </w:rPr>
-      </w:r>
-      <w:r>
-        <w:rPr>
+          <w:rtl/>
+          <w:cs/>
+          <w:lang w:val="ar_AE" w:bidi="ar_AE"/>
+        </w:rPr>
+      </w:r>
+      <w:r>
+        <w:rPr>
+          <w:rtl/>
+          <w:cs/>
           <w:lang w:val="ar_AE" w:bidi="ar_AE"/>
         </w:rPr>
         <w:t>يوضح العهد الجديد أن المؤمنين سيتعرضون إلى أزمنة إضطهاد وأنواع أخرى من الضيقات لأن الكثيرين في هذا العالم سوف يعارضون تعاليم المسيح.</w:t>
@@ -1651,11 +1987,15 @@
       </w:pPr>
       <w:r>
         <w:rPr>
-          <w:lang w:val="ar_AE" w:bidi="ar_AE"/>
-        </w:rPr>
-      </w:r>
-      <w:r>
-        <w:rPr>
+          <w:rtl/>
+          <w:cs/>
+          <w:lang w:val="ar_AE" w:bidi="ar_AE"/>
+        </w:rPr>
+      </w:r>
+      <w:r>
+        <w:rPr>
+          <w:rtl/>
+          <w:cs/>
           <w:lang w:val="ar_AE" w:bidi="ar_AE"/>
         </w:rPr>
         <w:t>يمكن أيضًا ترجمة مصطلح "الضيقة" إلى "وقت معاناة شديدة" أو "ضيق عميق" أو "صعوبات شديدة".</w:t>
@@ -1667,47 +2007,63 @@
       </w:pPr>
       <w:r>
         <w:rPr>
-          <w:lang w:val="ar_AE" w:bidi="ar_AE"/>
-        </w:rPr>
-      </w:r>
-      <w:r>
-        <w:rPr>
+          <w:rtl/>
+          <w:cs/>
+          <w:lang w:val="ar_AE" w:bidi="ar_AE"/>
+        </w:rPr>
+      </w:r>
+      <w:r>
+        <w:rPr>
+          <w:rtl/>
+          <w:cs/>
           <w:lang w:val="ar_AE" w:bidi="ar_AE"/>
         </w:rPr>
         <w:t xml:space="preserve">(انظر أيضًا: </w:t>
       </w:r>
       <w:r>
         <w:rPr>
+          <w:rtl/>
+          <w:cs/>
           <w:lang w:val="ar_AE" w:bidi="ar_AE"/>
         </w:rPr>
         <w:t>الأرض</w:t>
       </w:r>
       <w:r>
         <w:rPr>
+          <w:rtl/>
+          <w:cs/>
           <w:lang w:val="ar_AE" w:bidi="ar_AE"/>
         </w:rPr>
         <w:t xml:space="preserve">, </w:t>
       </w:r>
       <w:r>
         <w:rPr>
+          <w:rtl/>
+          <w:cs/>
           <w:lang w:val="ar_AE" w:bidi="ar_AE"/>
         </w:rPr>
         <w:t>التعليم</w:t>
       </w:r>
       <w:r>
         <w:rPr>
+          <w:rtl/>
+          <w:cs/>
           <w:lang w:val="ar_AE" w:bidi="ar_AE"/>
         </w:rPr>
         <w:t xml:space="preserve">, </w:t>
       </w:r>
       <w:r>
         <w:rPr>
+          <w:rtl/>
+          <w:cs/>
           <w:lang w:val="ar_AE" w:bidi="ar_AE"/>
         </w:rPr>
         <w:t>الغضب</w:t>
       </w:r>
       <w:r>
         <w:rPr>
+          <w:rtl/>
+          <w:cs/>
           <w:lang w:val="ar_AE" w:bidi="ar_AE"/>
         </w:rPr>
         <w:t>)</w:t>
@@ -1720,6 +2076,8 @@
       </w:pPr>
       <w:r>
         <w:rPr>
+          <w:rtl/>
+          <w:cs/>
           <w:lang w:val="ar_AE" w:bidi="ar_AE"/>
         </w:rPr>
         <w:t>نصوص كتابية:</w:t>
@@ -1734,12 +2092,16 @@
       </w:pPr>
       <w:r>
         <w:rPr>
+          <w:rtl/>
+          <w:cs/>
           <w:lang w:val="ar_AE" w:bidi="ar_AE"/>
         </w:rPr>
       </w:r>
       <w:hyperlink r:id="rId32">
         <w:r>
           <w:rPr>
+            <w:rtl/>
+            <w:cs/>
             <w:lang w:val="ar_AE" w:bidi="ar_AE"/>
           </w:rPr>
           <w:rPr>
@@ -1759,12 +2121,16 @@
       </w:pPr>
       <w:r>
         <w:rPr>
+          <w:rtl/>
+          <w:cs/>
           <w:lang w:val="ar_AE" w:bidi="ar_AE"/>
         </w:rPr>
       </w:r>
       <w:hyperlink r:id="rId33">
         <w:r>
           <w:rPr>
+            <w:rtl/>
+            <w:cs/>
             <w:lang w:val="ar_AE" w:bidi="ar_AE"/>
           </w:rPr>
           <w:rPr>
@@ -1784,12 +2150,16 @@
       </w:pPr>
       <w:r>
         <w:rPr>
+          <w:rtl/>
+          <w:cs/>
           <w:lang w:val="ar_AE" w:bidi="ar_AE"/>
         </w:rPr>
       </w:r>
       <w:hyperlink r:id="rId34">
         <w:r>
           <w:rPr>
+            <w:rtl/>
+            <w:cs/>
             <w:lang w:val="ar_AE" w:bidi="ar_AE"/>
           </w:rPr>
           <w:rPr>
@@ -1809,12 +2179,16 @@
       </w:pPr>
       <w:r>
         <w:rPr>
+          <w:rtl/>
+          <w:cs/>
           <w:lang w:val="ar_AE" w:bidi="ar_AE"/>
         </w:rPr>
       </w:r>
       <w:hyperlink r:id="rId35">
         <w:r>
           <w:rPr>
+            <w:rtl/>
+            <w:cs/>
             <w:lang w:val="ar_AE" w:bidi="ar_AE"/>
           </w:rPr>
           <w:rPr>
@@ -1834,12 +2208,16 @@
       </w:pPr>
       <w:r>
         <w:rPr>
+          <w:rtl/>
+          <w:cs/>
           <w:lang w:val="ar_AE" w:bidi="ar_AE"/>
         </w:rPr>
       </w:r>
       <w:hyperlink r:id="rId36">
         <w:r>
           <w:rPr>
+            <w:rtl/>
+            <w:cs/>
             <w:lang w:val="ar_AE" w:bidi="ar_AE"/>
           </w:rPr>
           <w:rPr>
@@ -1859,12 +2237,16 @@
       </w:pPr>
       <w:r>
         <w:rPr>
+          <w:rtl/>
+          <w:cs/>
           <w:lang w:val="ar_AE" w:bidi="ar_AE"/>
         </w:rPr>
       </w:r>
       <w:hyperlink r:id="rId37">
         <w:r>
           <w:rPr>
+            <w:rtl/>
+            <w:cs/>
             <w:lang w:val="ar_AE" w:bidi="ar_AE"/>
           </w:rPr>
           <w:rPr>
@@ -1882,6 +2264,8 @@
       </w:pPr>
       <w:r>
         <w:rPr>
+          <w:rtl/>
+          <w:cs/>
           <w:lang w:val="ar_AE" w:bidi="ar_AE"/>
         </w:rPr>
         <w:t>بيانات الكلمة:</w:t>
@@ -1896,22 +2280,30 @@
       </w:pPr>
       <w:r>
         <w:rPr>
-          <w:lang w:val="ar_AE" w:bidi="ar_AE"/>
-        </w:rPr>
-      </w:r>
-      <w:r>
-        <w:rPr>
+          <w:rtl/>
+          <w:cs/>
+          <w:lang w:val="ar_AE" w:bidi="ar_AE"/>
+        </w:rPr>
+      </w:r>
+      <w:r>
+        <w:rPr>
+          <w:rtl/>
+          <w:cs/>
           <w:lang w:val="ar_AE" w:bidi="ar_AE"/>
         </w:rPr>
         <w:t>سترونج: H6869، G23470، G44230</w:t>
       </w:r>
       <w:r>
         <w:rPr>
-          <w:lang w:val="ar_AE" w:bidi="ar_AE"/>
-        </w:rPr>
-      </w:r>
-      <w:r>
-        <w:rPr>
+          <w:rtl/>
+          <w:cs/>
+          <w:lang w:val="ar_AE" w:bidi="ar_AE"/>
+        </w:rPr>
+      </w:r>
+      <w:r>
+        <w:rPr>
+          <w:rtl/>
+          <w:cs/>
           <w:lang w:val="ar_AE" w:bidi="ar_AE"/>
         </w:rPr>
       </w:r>

</xml_diff>